<commit_message>
refactor: upodated all comparision
</commit_message>
<xml_diff>
--- a/Project_Report.docx
+++ b/Project_Report.docx
@@ -110,12 +110,6 @@
         <w:gridCol w:w="3273"/>
       </w:tblGrid>
       <w:tr>
-        <w:tblPrEx>
-          <w:tblCellMar>
-            <w:top w:w="0" w:type="dxa"/>
-            <w:bottom w:w="0" w:type="dxa"/>
-          </w:tblCellMar>
-        </w:tblPrEx>
         <w:trPr>
           <w:jc w:val="center"/>
         </w:trPr>
@@ -183,12 +177,6 @@
         </w:tc>
       </w:tr>
       <w:tr>
-        <w:tblPrEx>
-          <w:tblCellMar>
-            <w:top w:w="0" w:type="dxa"/>
-            <w:bottom w:w="0" w:type="dxa"/>
-          </w:tblCellMar>
-        </w:tblPrEx>
         <w:trPr>
           <w:jc w:val="center"/>
         </w:trPr>
@@ -251,12 +239,6 @@
         </w:tc>
       </w:tr>
       <w:tr>
-        <w:tblPrEx>
-          <w:tblCellMar>
-            <w:top w:w="0" w:type="dxa"/>
-            <w:bottom w:w="0" w:type="dxa"/>
-          </w:tblCellMar>
-        </w:tblPrEx>
         <w:trPr>
           <w:jc w:val="center"/>
         </w:trPr>
@@ -331,12 +313,6 @@
         </w:tc>
       </w:tr>
       <w:tr>
-        <w:tblPrEx>
-          <w:tblCellMar>
-            <w:top w:w="0" w:type="dxa"/>
-            <w:bottom w:w="0" w:type="dxa"/>
-          </w:tblCellMar>
-        </w:tblPrEx>
         <w:trPr>
           <w:jc w:val="center"/>
         </w:trPr>
@@ -399,12 +375,6 @@
         </w:tc>
       </w:tr>
       <w:tr>
-        <w:tblPrEx>
-          <w:tblCellMar>
-            <w:top w:w="0" w:type="dxa"/>
-            <w:bottom w:w="0" w:type="dxa"/>
-          </w:tblCellMar>
-        </w:tblPrEx>
         <w:trPr>
           <w:jc w:val="center"/>
         </w:trPr>
@@ -1597,12 +1567,6 @@
         <w:gridCol w:w="6360"/>
       </w:tblGrid>
       <w:tr>
-        <w:tblPrEx>
-          <w:tblCellMar>
-            <w:top w:w="0" w:type="dxa"/>
-            <w:bottom w:w="0" w:type="dxa"/>
-          </w:tblCellMar>
-        </w:tblPrEx>
         <w:trPr>
           <w:tblHeader/>
         </w:trPr>
@@ -1668,12 +1632,6 @@
         </w:tc>
       </w:tr>
       <w:tr>
-        <w:tblPrEx>
-          <w:tblCellMar>
-            <w:top w:w="0" w:type="dxa"/>
-            <w:bottom w:w="0" w:type="dxa"/>
-          </w:tblCellMar>
-        </w:tblPrEx>
         <w:tc>
           <w:tcPr>
             <w:tcW w:w="3000" w:type="dxa"/>
@@ -1730,12 +1688,6 @@
         </w:tc>
       </w:tr>
       <w:tr>
-        <w:tblPrEx>
-          <w:tblCellMar>
-            <w:top w:w="0" w:type="dxa"/>
-            <w:bottom w:w="0" w:type="dxa"/>
-          </w:tblCellMar>
-        </w:tblPrEx>
         <w:tc>
           <w:tcPr>
             <w:tcW w:w="3000" w:type="dxa"/>
@@ -1792,12 +1744,6 @@
         </w:tc>
       </w:tr>
       <w:tr>
-        <w:tblPrEx>
-          <w:tblCellMar>
-            <w:top w:w="0" w:type="dxa"/>
-            <w:bottom w:w="0" w:type="dxa"/>
-          </w:tblCellMar>
-        </w:tblPrEx>
         <w:tc>
           <w:tcPr>
             <w:tcW w:w="3000" w:type="dxa"/>
@@ -1988,12 +1934,6 @@
         <w:gridCol w:w="3660"/>
       </w:tblGrid>
       <w:tr>
-        <w:tblPrEx>
-          <w:tblCellMar>
-            <w:top w:w="0" w:type="dxa"/>
-            <w:bottom w:w="0" w:type="dxa"/>
-          </w:tblCellMar>
-        </w:tblPrEx>
         <w:trPr>
           <w:tblHeader/>
         </w:trPr>
@@ -2089,12 +2029,6 @@
         </w:tc>
       </w:tr>
       <w:tr>
-        <w:tblPrEx>
-          <w:tblCellMar>
-            <w:top w:w="0" w:type="dxa"/>
-            <w:bottom w:w="0" w:type="dxa"/>
-          </w:tblCellMar>
-        </w:tblPrEx>
         <w:tc>
           <w:tcPr>
             <w:tcW w:w="2200" w:type="dxa"/>
@@ -2178,12 +2112,6 @@
         </w:tc>
       </w:tr>
       <w:tr>
-        <w:tblPrEx>
-          <w:tblCellMar>
-            <w:top w:w="0" w:type="dxa"/>
-            <w:bottom w:w="0" w:type="dxa"/>
-          </w:tblCellMar>
-        </w:tblPrEx>
         <w:tc>
           <w:tcPr>
             <w:tcW w:w="2200" w:type="dxa"/>
@@ -2267,12 +2195,6 @@
         </w:tc>
       </w:tr>
       <w:tr>
-        <w:tblPrEx>
-          <w:tblCellMar>
-            <w:top w:w="0" w:type="dxa"/>
-            <w:bottom w:w="0" w:type="dxa"/>
-          </w:tblCellMar>
-        </w:tblPrEx>
         <w:tc>
           <w:tcPr>
             <w:tcW w:w="2200" w:type="dxa"/>
@@ -2371,12 +2293,6 @@
         </w:tc>
       </w:tr>
       <w:tr>
-        <w:tblPrEx>
-          <w:tblCellMar>
-            <w:top w:w="0" w:type="dxa"/>
-            <w:bottom w:w="0" w:type="dxa"/>
-          </w:tblCellMar>
-        </w:tblPrEx>
         <w:tc>
           <w:tcPr>
             <w:tcW w:w="2200" w:type="dxa"/>
@@ -2663,11 +2579,263 @@
     </w:p>
     <w:p>
       <w:pPr>
+        <w:spacing w:after="80"/>
+        <w:rPr>
+          <w:lang w:val="en-US"/>
+        </w:rPr>
+      </w:pPr>
+      <w:r>
+        <w:rPr>
+          <w:lang w:val="en-US"/>
+        </w:rPr>
+        <w:lastRenderedPageBreak/>
+        <w:drawing>
+          <wp:inline distT="0" distB="0" distL="0" distR="0" wp14:anchorId="58487E61" wp14:editId="72B2724F">
+            <wp:extent cx="6248400" cy="2915920"/>
+            <wp:effectExtent l="0" t="0" r="0" b="0"/>
+            <wp:docPr id="552518315" name="Picture 1"/>
+            <wp:cNvGraphicFramePr>
+              <a:graphicFrameLocks xmlns:a="http://schemas.openxmlformats.org/drawingml/2006/main" noChangeAspect="1"/>
+            </wp:cNvGraphicFramePr>
+            <a:graphic xmlns:a="http://schemas.openxmlformats.org/drawingml/2006/main">
+              <a:graphicData uri="http://schemas.openxmlformats.org/drawingml/2006/picture">
+                <pic:pic xmlns:pic="http://schemas.openxmlformats.org/drawingml/2006/picture">
+                  <pic:nvPicPr>
+                    <pic:cNvPr id="552518315" name=""/>
+                    <pic:cNvPicPr/>
+                  </pic:nvPicPr>
+                  <pic:blipFill>
+                    <a:blip r:embed="rId7"/>
+                    <a:stretch>
+                      <a:fillRect/>
+                    </a:stretch>
+                  </pic:blipFill>
+                  <pic:spPr>
+                    <a:xfrm>
+                      <a:off x="0" y="0"/>
+                      <a:ext cx="6248400" cy="2915920"/>
+                    </a:xfrm>
+                    <a:prstGeom prst="rect">
+                      <a:avLst/>
+                    </a:prstGeom>
+                  </pic:spPr>
+                </pic:pic>
+              </a:graphicData>
+            </a:graphic>
+          </wp:inline>
+        </w:drawing>
+      </w:r>
+      <w:r>
+        <w:rPr>
+          <w:lang w:val="en-US"/>
+        </w:rPr>
+        <w:lastRenderedPageBreak/>
+        <w:drawing>
+          <wp:inline distT="0" distB="0" distL="0" distR="0" wp14:anchorId="4549E22A" wp14:editId="3E763129">
+            <wp:extent cx="4163006" cy="5849166"/>
+            <wp:effectExtent l="0" t="0" r="9525" b="0"/>
+            <wp:docPr id="1379589579" name="Picture 1"/>
+            <wp:cNvGraphicFramePr>
+              <a:graphicFrameLocks xmlns:a="http://schemas.openxmlformats.org/drawingml/2006/main" noChangeAspect="1"/>
+            </wp:cNvGraphicFramePr>
+            <a:graphic xmlns:a="http://schemas.openxmlformats.org/drawingml/2006/main">
+              <a:graphicData uri="http://schemas.openxmlformats.org/drawingml/2006/picture">
+                <pic:pic xmlns:pic="http://schemas.openxmlformats.org/drawingml/2006/picture">
+                  <pic:nvPicPr>
+                    <pic:cNvPr id="1379589579" name=""/>
+                    <pic:cNvPicPr/>
+                  </pic:nvPicPr>
+                  <pic:blipFill>
+                    <a:blip r:embed="rId8"/>
+                    <a:stretch>
+                      <a:fillRect/>
+                    </a:stretch>
+                  </pic:blipFill>
+                  <pic:spPr>
+                    <a:xfrm>
+                      <a:off x="0" y="0"/>
+                      <a:ext cx="4163006" cy="5849166"/>
+                    </a:xfrm>
+                    <a:prstGeom prst="rect">
+                      <a:avLst/>
+                    </a:prstGeom>
+                  </pic:spPr>
+                </pic:pic>
+              </a:graphicData>
+            </a:graphic>
+          </wp:inline>
+        </w:drawing>
+      </w:r>
+      <w:r>
+        <w:rPr>
+          <w:lang w:val="en-US"/>
+        </w:rPr>
+        <w:lastRenderedPageBreak/>
+        <w:drawing>
+          <wp:inline distT="0" distB="0" distL="0" distR="0" wp14:anchorId="6F726B87" wp14:editId="0D5EBFE2">
+            <wp:extent cx="6248400" cy="4001770"/>
+            <wp:effectExtent l="0" t="0" r="0" b="0"/>
+            <wp:docPr id="1837450779" name="Picture 1"/>
+            <wp:cNvGraphicFramePr>
+              <a:graphicFrameLocks xmlns:a="http://schemas.openxmlformats.org/drawingml/2006/main" noChangeAspect="1"/>
+            </wp:cNvGraphicFramePr>
+            <a:graphic xmlns:a="http://schemas.openxmlformats.org/drawingml/2006/main">
+              <a:graphicData uri="http://schemas.openxmlformats.org/drawingml/2006/picture">
+                <pic:pic xmlns:pic="http://schemas.openxmlformats.org/drawingml/2006/picture">
+                  <pic:nvPicPr>
+                    <pic:cNvPr id="1837450779" name=""/>
+                    <pic:cNvPicPr/>
+                  </pic:nvPicPr>
+                  <pic:blipFill>
+                    <a:blip r:embed="rId9"/>
+                    <a:stretch>
+                      <a:fillRect/>
+                    </a:stretch>
+                  </pic:blipFill>
+                  <pic:spPr>
+                    <a:xfrm>
+                      <a:off x="0" y="0"/>
+                      <a:ext cx="6248400" cy="4001770"/>
+                    </a:xfrm>
+                    <a:prstGeom prst="rect">
+                      <a:avLst/>
+                    </a:prstGeom>
+                  </pic:spPr>
+                </pic:pic>
+              </a:graphicData>
+            </a:graphic>
+          </wp:inline>
+        </w:drawing>
+      </w:r>
+      <w:r>
+        <w:rPr>
+          <w:lang w:val="en-US"/>
+        </w:rPr>
+        <w:drawing>
+          <wp:inline distT="0" distB="0" distL="0" distR="0" wp14:anchorId="21B8BFFE" wp14:editId="43044E1D">
+            <wp:extent cx="6248400" cy="2583815"/>
+            <wp:effectExtent l="0" t="0" r="0" b="6985"/>
+            <wp:docPr id="77770550" name="Picture 1"/>
+            <wp:cNvGraphicFramePr>
+              <a:graphicFrameLocks xmlns:a="http://schemas.openxmlformats.org/drawingml/2006/main" noChangeAspect="1"/>
+            </wp:cNvGraphicFramePr>
+            <a:graphic xmlns:a="http://schemas.openxmlformats.org/drawingml/2006/main">
+              <a:graphicData uri="http://schemas.openxmlformats.org/drawingml/2006/picture">
+                <pic:pic xmlns:pic="http://schemas.openxmlformats.org/drawingml/2006/picture">
+                  <pic:nvPicPr>
+                    <pic:cNvPr id="77770550" name=""/>
+                    <pic:cNvPicPr/>
+                  </pic:nvPicPr>
+                  <pic:blipFill>
+                    <a:blip r:embed="rId10"/>
+                    <a:stretch>
+                      <a:fillRect/>
+                    </a:stretch>
+                  </pic:blipFill>
+                  <pic:spPr>
+                    <a:xfrm>
+                      <a:off x="0" y="0"/>
+                      <a:ext cx="6248400" cy="2583815"/>
+                    </a:xfrm>
+                    <a:prstGeom prst="rect">
+                      <a:avLst/>
+                    </a:prstGeom>
+                  </pic:spPr>
+                </pic:pic>
+              </a:graphicData>
+            </a:graphic>
+          </wp:inline>
+        </w:drawing>
+      </w:r>
+      <w:r>
+        <w:rPr>
+          <w:lang w:val="en-US"/>
+        </w:rPr>
+        <w:lastRenderedPageBreak/>
+        <w:drawing>
+          <wp:inline distT="0" distB="0" distL="0" distR="0" wp14:anchorId="3F94D105" wp14:editId="1BDEC0ED">
+            <wp:extent cx="6248400" cy="2633980"/>
+            <wp:effectExtent l="0" t="0" r="0" b="0"/>
+            <wp:docPr id="273221769" name="Picture 1"/>
+            <wp:cNvGraphicFramePr>
+              <a:graphicFrameLocks xmlns:a="http://schemas.openxmlformats.org/drawingml/2006/main" noChangeAspect="1"/>
+            </wp:cNvGraphicFramePr>
+            <a:graphic xmlns:a="http://schemas.openxmlformats.org/drawingml/2006/main">
+              <a:graphicData uri="http://schemas.openxmlformats.org/drawingml/2006/picture">
+                <pic:pic xmlns:pic="http://schemas.openxmlformats.org/drawingml/2006/picture">
+                  <pic:nvPicPr>
+                    <pic:cNvPr id="273221769" name=""/>
+                    <pic:cNvPicPr/>
+                  </pic:nvPicPr>
+                  <pic:blipFill>
+                    <a:blip r:embed="rId11"/>
+                    <a:stretch>
+                      <a:fillRect/>
+                    </a:stretch>
+                  </pic:blipFill>
+                  <pic:spPr>
+                    <a:xfrm>
+                      <a:off x="0" y="0"/>
+                      <a:ext cx="6248400" cy="2633980"/>
+                    </a:xfrm>
+                    <a:prstGeom prst="rect">
+                      <a:avLst/>
+                    </a:prstGeom>
+                  </pic:spPr>
+                </pic:pic>
+              </a:graphicData>
+            </a:graphic>
+          </wp:inline>
+        </w:drawing>
+      </w:r>
+      <w:r>
+        <w:rPr>
+          <w:lang w:val="en-US"/>
+        </w:rPr>
+        <w:drawing>
+          <wp:inline distT="0" distB="0" distL="0" distR="0" wp14:anchorId="1A546AC2" wp14:editId="29E7D8D2">
+            <wp:extent cx="6248400" cy="2120900"/>
+            <wp:effectExtent l="0" t="0" r="0" b="0"/>
+            <wp:docPr id="416325090" name="Picture 1"/>
+            <wp:cNvGraphicFramePr>
+              <a:graphicFrameLocks xmlns:a="http://schemas.openxmlformats.org/drawingml/2006/main" noChangeAspect="1"/>
+            </wp:cNvGraphicFramePr>
+            <a:graphic xmlns:a="http://schemas.openxmlformats.org/drawingml/2006/main">
+              <a:graphicData uri="http://schemas.openxmlformats.org/drawingml/2006/picture">
+                <pic:pic xmlns:pic="http://schemas.openxmlformats.org/drawingml/2006/picture">
+                  <pic:nvPicPr>
+                    <pic:cNvPr id="416325090" name=""/>
+                    <pic:cNvPicPr/>
+                  </pic:nvPicPr>
+                  <pic:blipFill>
+                    <a:blip r:embed="rId12"/>
+                    <a:stretch>
+                      <a:fillRect/>
+                    </a:stretch>
+                  </pic:blipFill>
+                  <pic:spPr>
+                    <a:xfrm>
+                      <a:off x="0" y="0"/>
+                      <a:ext cx="6248400" cy="2120900"/>
+                    </a:xfrm>
+                    <a:prstGeom prst="rect">
+                      <a:avLst/>
+                    </a:prstGeom>
+                  </pic:spPr>
+                </pic:pic>
+              </a:graphicData>
+            </a:graphic>
+          </wp:inline>
+        </w:drawing>
+      </w:r>
+    </w:p>
+    <w:p>
+      <w:pPr>
         <w:spacing w:after="200"/>
       </w:pPr>
     </w:p>
     <w:sectPr>
-      <w:footerReference w:type="default" r:id="rId7"/>
+      <w:footerReference w:type="default" r:id="rId13"/>
       <w:pgSz w:w="12240" w:h="15840"/>
       <w:pgMar w:top="1200" w:right="1200" w:bottom="1200" w:left="1200" w:header="708" w:footer="708" w:gutter="0"/>
       <w:cols w:space="720"/>

</xml_diff>